<commit_message>
Add HR Administrative Officer role, fix Baazar start month
Adds the HR Administrative Officer casual role at Monash University
(Aug-Oct 2026, HR Projects team) to the Experience log and both resume
files, using only the facts confirmed on the signed offer letter since
no specific duties were listed beyond "as directed". Also corrects the
Baazar internship start date in the resume files to September 2026
(it read August, out of sync with the site).

Co-Authored-By: Claude Sonnet 5 <noreply@anthropic.com>
Claude-Session: https://claude.ai/code/session_018fL7XbNAnV8MdDoG4hnUEg
</commit_message>
<xml_diff>
--- a/Madhumitha_Challa_Intern_Graduate.docx
+++ b/Madhumitha_Challa_Intern_Graduate.docx
@@ -111,6 +111,30 @@
         <w:spacing w:after="100" w:before="100"/>
       </w:pPr>
       <w:r>
+        <w:t>HR Administrative Officer | Monash University</w:t>
+      </w:r>
+    </w:p>
+    <w:p>
+      <w:pPr>
+        <w:spacing w:after="100"/>
+      </w:pPr>
+      <w:r>
+        <w:t>August 2026–October 2026</w:t>
+      </w:r>
+    </w:p>
+    <w:p>
+      <w:pPr>
+        <w:spacing w:after="50"/>
+      </w:pPr>
+      <w:r>
+        <w:t>• Casual HR Administrative Officer role (HEW 4, ~10 hrs/week) within the HR Projects team, Office of the Chief Operating Officer &amp; Senior Vice-President, Clayton Campus</w:t>
+      </w:r>
+    </w:p>
+    <w:p>
+      <w:pPr>
+        <w:spacing w:after="100" w:before="100"/>
+      </w:pPr>
+      <w:r>
         <w:t xml:space="preserve">Technology &amp; Digital Innovation Intern | Baazar (Fund'ex venture)</w:t>
       </w:r>
     </w:p>
@@ -119,7 +143,7 @@
         <w:spacing w:after="100"/>
       </w:pPr>
       <w:r>
-        <w:t xml:space="preserve">August 2026–Present</w:t>
+        <w:t>September 2026–Present</w:t>
       </w:r>
     </w:p>
     <w:p>

</xml_diff>